<commit_message>
Disable visual diagrams by default and make Submit and Next buttons sticky at bottom
</commit_message>
<xml_diff>
--- a/documentation/AstroQuest_Implementation_Documentation.docx
+++ b/documentation/AstroQuest_Implementation_Documentation.docx
@@ -5505,7 +5505,7 @@
                 <w:sz w:val="19"/>
                 <w:szCs w:val="19"/>
               </w:rPr>
-              <w:t xml:space="preserve">Visual Diagrams toggle: Shown or Hidden.</w:t>
+              <w:t xml:space="preserve">Visual Diagrams toggle: Disabled by Default (Hidden / Shown).</w:t>
             </w:r>
           </w:p>
         </w:tc>
@@ -5551,73 +5551,73 @@
                 <w:sz w:val="19"/>
                 <w:szCs w:val="19"/>
               </w:rPr>
-              <w:t xml:space="preserve">Spatial &amp; Physics Diagrams</w:t>
-            </w:r>
-          </w:p>
-        </w:tc>
-        <w:tc>
-          <w:tcPr>
-            <w:shd w:fill="FFFFFF" w:val="clear"/>
-            <w:tcMar>
-              <w:top w:type="dxa" w:w="100"/>
-              <w:left w:type="dxa" w:w="140"/>
-              <w:bottom w:type="dxa" w:w="100"/>
-              <w:right w:type="dxa" w:w="140"/>
-            </w:tcMar>
-          </w:tcPr>
-          <w:p>
-            <w:r>
-              <w:rPr>
-                <w:rFonts w:ascii="Calibri" w:cs="Calibri" w:eastAsia="Calibri" w:hAnsi="Calibri"/>
-                <w:color w:val="0F172A"/>
-                <w:sz w:val="19"/>
-                <w:szCs w:val="19"/>
-              </w:rPr>
-              <w:t xml:space="preserve">Renders 3x3 matrices, 3D isometric cube towers, optics light dispersion prisms, and rotation turns.</w:t>
-            </w:r>
-          </w:p>
-        </w:tc>
-        <w:tc>
-          <w:tcPr>
-            <w:shd w:fill="FFFFFF" w:val="clear"/>
-            <w:tcMar>
-              <w:top w:type="dxa" w:w="100"/>
-              <w:left w:type="dxa" w:w="140"/>
-              <w:bottom w:type="dxa" w:w="100"/>
-              <w:right w:type="dxa" w:w="140"/>
-            </w:tcMar>
-          </w:tcPr>
-          <w:p>
-            <w:r>
-              <w:rPr>
-                <w:rFonts w:ascii="Calibri" w:cs="Calibri" w:eastAsia="Calibri" w:hAnsi="Calibri"/>
-                <w:color w:val="0F172A"/>
-                <w:sz w:val="19"/>
-                <w:szCs w:val="19"/>
-              </w:rPr>
-              <w:t xml:space="preserve">Automatic activation based on question topic domain.</w:t>
-            </w:r>
-          </w:p>
-        </w:tc>
-        <w:tc>
-          <w:tcPr>
-            <w:shd w:fill="FFFFFF" w:val="clear"/>
-            <w:tcMar>
-              <w:top w:type="dxa" w:w="100"/>
-              <w:left w:type="dxa" w:w="140"/>
-              <w:bottom w:type="dxa" w:w="100"/>
-              <w:right w:type="dxa" w:w="140"/>
-            </w:tcMar>
-          </w:tcPr>
-          <w:p>
-            <w:r>
-              <w:rPr>
-                <w:rFonts w:ascii="Calibri" w:cs="Calibri" w:eastAsia="Calibri" w:hAnsi="Calibri"/>
-                <w:color w:val="0F172A"/>
-                <w:sz w:val="19"/>
-                <w:szCs w:val="19"/>
-              </w:rPr>
-              <w:t xml:space="preserve">utils/VisualDiagrams.jsx</w:t>
+              <w:t xml:space="preserve">Sticky Submit &amp; Next Buttons</w:t>
+            </w:r>
+          </w:p>
+        </w:tc>
+        <w:tc>
+          <w:tcPr>
+            <w:shd w:fill="FFFFFF" w:val="clear"/>
+            <w:tcMar>
+              <w:top w:type="dxa" w:w="100"/>
+              <w:left w:type="dxa" w:w="140"/>
+              <w:bottom w:type="dxa" w:w="100"/>
+              <w:right w:type="dxa" w:w="140"/>
+            </w:tcMar>
+          </w:tcPr>
+          <w:p>
+            <w:r>
+              <w:rPr>
+                <w:rFonts w:ascii="Calibri" w:cs="Calibri" w:eastAsia="Calibri" w:hAnsi="Calibri"/>
+                <w:color w:val="0F172A"/>
+                <w:sz w:val="19"/>
+                <w:szCs w:val="19"/>
+              </w:rPr>
+              <w:t xml:space="preserve">Submit action bar (Hint, Skip, Submit) and Solution Next button remain sticky at bottom of screen when options or solutions scroll.</w:t>
+            </w:r>
+          </w:p>
+        </w:tc>
+        <w:tc>
+          <w:tcPr>
+            <w:shd w:fill="FFFFFF" w:val="clear"/>
+            <w:tcMar>
+              <w:top w:type="dxa" w:w="100"/>
+              <w:left w:type="dxa" w:w="140"/>
+              <w:bottom w:type="dxa" w:w="100"/>
+              <w:right w:type="dxa" w:w="140"/>
+            </w:tcMar>
+          </w:tcPr>
+          <w:p>
+            <w:r>
+              <w:rPr>
+                <w:rFonts w:ascii="Calibri" w:cs="Calibri" w:eastAsia="Calibri" w:hAnsi="Calibri"/>
+                <w:color w:val="0F172A"/>
+                <w:sz w:val="19"/>
+                <w:szCs w:val="19"/>
+              </w:rPr>
+              <w:t xml:space="preserve">Always docked with glassmorphic cosmic blur backdrop.</w:t>
+            </w:r>
+          </w:p>
+        </w:tc>
+        <w:tc>
+          <w:tcPr>
+            <w:shd w:fill="FFFFFF" w:val="clear"/>
+            <w:tcMar>
+              <w:top w:type="dxa" w:w="100"/>
+              <w:left w:type="dxa" w:w="140"/>
+              <w:bottom w:type="dxa" w:w="100"/>
+              <w:right w:type="dxa" w:w="140"/>
+            </w:tcMar>
+          </w:tcPr>
+          <w:p>
+            <w:r>
+              <w:rPr>
+                <w:rFonts w:ascii="Calibri" w:cs="Calibri" w:eastAsia="Calibri" w:hAnsi="Calibri"/>
+                <w:color w:val="0F172A"/>
+                <w:sz w:val="19"/>
+                <w:szCs w:val="19"/>
+              </w:rPr>
+              <w:t xml:space="preserve">App.jsx &amp; SolutionPanel.jsx</w:t>
             </w:r>
           </w:p>
         </w:tc>
@@ -5641,7 +5641,7 @@
                 <w:sz w:val="19"/>
                 <w:szCs w:val="19"/>
               </w:rPr>
-              <w:t xml:space="preserve">Per-Question Countdown Timer</w:t>
+              <w:t xml:space="preserve">Spatial &amp; Physics Diagrams</w:t>
             </w:r>
           </w:p>
         </w:tc>
@@ -5663,7 +5663,7 @@
                 <w:sz w:val="19"/>
                 <w:szCs w:val="19"/>
               </w:rPr>
-              <w:t xml:space="preserve">Challenges student with per-question time limits and dynamic urgency color badges.</w:t>
+              <w:t xml:space="preserve">Renders 3x3 matrices, 3D isometric cube towers, optics light dispersion prisms, and rotation turns.</w:t>
             </w:r>
           </w:p>
         </w:tc>
@@ -5685,7 +5685,7 @@
                 <w:sz w:val="19"/>
                 <w:szCs w:val="19"/>
               </w:rPr>
-              <w:t xml:space="preserve">Toggle ON/OFF, Presets (45s, 60s, 90s, 2m, 3m) or Custom (15s-300s).</w:t>
+              <w:t xml:space="preserve">Automatic activation based on question topic domain.</w:t>
             </w:r>
           </w:p>
         </w:tc>
@@ -5707,7 +5707,7 @@
                 <w:sz w:val="19"/>
                 <w:szCs w:val="19"/>
               </w:rPr>
-              <w:t xml:space="preserve">features/quest/QuestionCard.jsx</w:t>
+              <w:t xml:space="preserve">utils/VisualDiagrams.jsx</w:t>
             </w:r>
           </w:p>
         </w:tc>
@@ -5731,73 +5731,73 @@
                 <w:sz w:val="19"/>
                 <w:szCs w:val="19"/>
               </w:rPr>
-              <w:t xml:space="preserve">Auto-Advance Pacing</w:t>
-            </w:r>
-          </w:p>
-        </w:tc>
-        <w:tc>
-          <w:tcPr>
-            <w:shd w:fill="FFFFFF" w:val="clear"/>
-            <w:tcMar>
-              <w:top w:type="dxa" w:w="100"/>
-              <w:left w:type="dxa" w:w="140"/>
-              <w:bottom w:type="dxa" w:w="100"/>
-              <w:right w:type="dxa" w:w="140"/>
-            </w:tcMar>
-          </w:tcPr>
-          <w:p>
-            <w:r>
-              <w:rPr>
-                <w:rFonts w:ascii="Calibri" w:cs="Calibri" w:eastAsia="Calibri" w:hAnsi="Calibri"/>
-                <w:color w:val="0F172A"/>
-                <w:sz w:val="19"/>
-                <w:szCs w:val="19"/>
-              </w:rPr>
-              <w:t xml:space="preserve">Displays solution explanation for configured duration with live countdown, then advances.</w:t>
-            </w:r>
-          </w:p>
-        </w:tc>
-        <w:tc>
-          <w:tcPr>
-            <w:shd w:fill="FFFFFF" w:val="clear"/>
-            <w:tcMar>
-              <w:top w:type="dxa" w:w="100"/>
-              <w:left w:type="dxa" w:w="140"/>
-              <w:bottom w:type="dxa" w:w="100"/>
-              <w:right w:type="dxa" w:w="140"/>
-            </w:tcMar>
-          </w:tcPr>
-          <w:p>
-            <w:r>
-              <w:rPr>
-                <w:rFonts w:ascii="Calibri" w:cs="Calibri" w:eastAsia="Calibri" w:hAnsi="Calibri"/>
-                <w:color w:val="0F172A"/>
-                <w:sz w:val="19"/>
-                <w:szCs w:val="19"/>
-              </w:rPr>
-              <w:t xml:space="preserve">Toggle ON/OFF, Presets (3s, 5s, 7s, 10s, 15s) or Custom (2s-30s).</w:t>
-            </w:r>
-          </w:p>
-        </w:tc>
-        <w:tc>
-          <w:tcPr>
-            <w:shd w:fill="FFFFFF" w:val="clear"/>
-            <w:tcMar>
-              <w:top w:type="dxa" w:w="100"/>
-              <w:left w:type="dxa" w:w="140"/>
-              <w:bottom w:type="dxa" w:w="100"/>
-              <w:right w:type="dxa" w:w="140"/>
-            </w:tcMar>
-          </w:tcPr>
-          <w:p>
-            <w:r>
-              <w:rPr>
-                <w:rFonts w:ascii="Calibri" w:cs="Calibri" w:eastAsia="Calibri" w:hAnsi="Calibri"/>
-                <w:color w:val="0F172A"/>
-                <w:sz w:val="19"/>
-                <w:szCs w:val="19"/>
-              </w:rPr>
-              <w:t xml:space="preserve">features/quest/SolutionPanel.jsx</w:t>
+              <w:t xml:space="preserve">Per-Question Countdown Timer</w:t>
+            </w:r>
+          </w:p>
+        </w:tc>
+        <w:tc>
+          <w:tcPr>
+            <w:shd w:fill="FFFFFF" w:val="clear"/>
+            <w:tcMar>
+              <w:top w:type="dxa" w:w="100"/>
+              <w:left w:type="dxa" w:w="140"/>
+              <w:bottom w:type="dxa" w:w="100"/>
+              <w:right w:type="dxa" w:w="140"/>
+            </w:tcMar>
+          </w:tcPr>
+          <w:p>
+            <w:r>
+              <w:rPr>
+                <w:rFonts w:ascii="Calibri" w:cs="Calibri" w:eastAsia="Calibri" w:hAnsi="Calibri"/>
+                <w:color w:val="0F172A"/>
+                <w:sz w:val="19"/>
+                <w:szCs w:val="19"/>
+              </w:rPr>
+              <w:t xml:space="preserve">Challenges student with per-question time limits and dynamic urgency color badges.</w:t>
+            </w:r>
+          </w:p>
+        </w:tc>
+        <w:tc>
+          <w:tcPr>
+            <w:shd w:fill="FFFFFF" w:val="clear"/>
+            <w:tcMar>
+              <w:top w:type="dxa" w:w="100"/>
+              <w:left w:type="dxa" w:w="140"/>
+              <w:bottom w:type="dxa" w:w="100"/>
+              <w:right w:type="dxa" w:w="140"/>
+            </w:tcMar>
+          </w:tcPr>
+          <w:p>
+            <w:r>
+              <w:rPr>
+                <w:rFonts w:ascii="Calibri" w:cs="Calibri" w:eastAsia="Calibri" w:hAnsi="Calibri"/>
+                <w:color w:val="0F172A"/>
+                <w:sz w:val="19"/>
+                <w:szCs w:val="19"/>
+              </w:rPr>
+              <w:t xml:space="preserve">Toggle ON/OFF, Presets (45s, 60s, 90s, 2m, 3m) or Custom (15s-300s).</w:t>
+            </w:r>
+          </w:p>
+        </w:tc>
+        <w:tc>
+          <w:tcPr>
+            <w:shd w:fill="FFFFFF" w:val="clear"/>
+            <w:tcMar>
+              <w:top w:type="dxa" w:w="100"/>
+              <w:left w:type="dxa" w:w="140"/>
+              <w:bottom w:type="dxa" w:w="100"/>
+              <w:right w:type="dxa" w:w="140"/>
+            </w:tcMar>
+          </w:tcPr>
+          <w:p>
+            <w:r>
+              <w:rPr>
+                <w:rFonts w:ascii="Calibri" w:cs="Calibri" w:eastAsia="Calibri" w:hAnsi="Calibri"/>
+                <w:color w:val="0F172A"/>
+                <w:sz w:val="19"/>
+                <w:szCs w:val="19"/>
+              </w:rPr>
+              <w:t xml:space="preserve">features/quest/QuestionCard.jsx</w:t>
             </w:r>
           </w:p>
         </w:tc>
@@ -5821,7 +5821,7 @@
                 <w:sz w:val="19"/>
                 <w:szCs w:val="19"/>
               </w:rPr>
-              <w:t xml:space="preserve">Skip Question Option</w:t>
+              <w:t xml:space="preserve">Auto-Advance Pacing</w:t>
             </w:r>
           </w:p>
         </w:tc>
@@ -5843,7 +5843,7 @@
                 <w:sz w:val="19"/>
                 <w:szCs w:val="19"/>
               </w:rPr>
-              <w:t xml:space="preserve">Allows explorer to skip unfamiliar questions; records skips in score report without penalty.</w:t>
+              <w:t xml:space="preserve">Displays solution explanation for configured duration with live countdown, then advances.</w:t>
             </w:r>
           </w:p>
         </w:tc>
@@ -5865,7 +5865,7 @@
                 <w:sz w:val="19"/>
                 <w:szCs w:val="19"/>
               </w:rPr>
-              <w:t xml:space="preserve">SkipForward (⏭️) button in bottom action bar.</w:t>
+              <w:t xml:space="preserve">Toggle ON/OFF, Presets (3s, 5s, 7s, 10s, 15s) or Custom (2s-30s).</w:t>
             </w:r>
           </w:p>
         </w:tc>
@@ -5887,7 +5887,7 @@
                 <w:sz w:val="19"/>
                 <w:szCs w:val="19"/>
               </w:rPr>
-              <w:t xml:space="preserve">features/quest/QuestionCard.jsx</w:t>
+              <w:t xml:space="preserve">features/quest/SolutionPanel.jsx</w:t>
             </w:r>
           </w:p>
         </w:tc>
@@ -5911,73 +5911,73 @@
                 <w:sz w:val="19"/>
                 <w:szCs w:val="19"/>
               </w:rPr>
-              <w:t xml:space="preserve">Cognitive Hint Modal</w:t>
-            </w:r>
-          </w:p>
-        </w:tc>
-        <w:tc>
-          <w:tcPr>
-            <w:shd w:fill="FFFFFF" w:val="clear"/>
-            <w:tcMar>
-              <w:top w:type="dxa" w:w="100"/>
-              <w:left w:type="dxa" w:w="140"/>
-              <w:bottom w:type="dxa" w:w="100"/>
-              <w:right w:type="dxa" w:w="140"/>
-            </w:tcMar>
-          </w:tcPr>
-          <w:p>
-            <w:r>
-              <w:rPr>
-                <w:rFonts w:ascii="Calibri" w:cs="Calibri" w:eastAsia="Calibri" w:hAnsi="Calibri"/>
-                <w:color w:val="0F172A"/>
-                <w:sz w:val="19"/>
-                <w:szCs w:val="19"/>
-              </w:rPr>
-              <w:t xml:space="preserve">Opens age-appropriate hints to guide the explorer without giving away the direct answer.</w:t>
-            </w:r>
-          </w:p>
-        </w:tc>
-        <w:tc>
-          <w:tcPr>
-            <w:shd w:fill="FFFFFF" w:val="clear"/>
-            <w:tcMar>
-              <w:top w:type="dxa" w:w="100"/>
-              <w:left w:type="dxa" w:w="140"/>
-              <w:bottom w:type="dxa" w:w="100"/>
-              <w:right w:type="dxa" w:w="140"/>
-            </w:tcMar>
-          </w:tcPr>
-          <w:p>
-            <w:r>
-              <w:rPr>
-                <w:rFonts w:ascii="Calibri" w:cs="Calibri" w:eastAsia="Calibri" w:hAnsi="Calibri"/>
-                <w:color w:val="0F172A"/>
-                <w:sz w:val="19"/>
-                <w:szCs w:val="19"/>
-              </w:rPr>
-              <w:t xml:space="preserve">Zap (⚡) hint button in bottom action bar.</w:t>
-            </w:r>
-          </w:p>
-        </w:tc>
-        <w:tc>
-          <w:tcPr>
-            <w:shd w:fill="FFFFFF" w:val="clear"/>
-            <w:tcMar>
-              <w:top w:type="dxa" w:w="100"/>
-              <w:left w:type="dxa" w:w="140"/>
-              <w:bottom w:type="dxa" w:w="100"/>
-              <w:right w:type="dxa" w:w="140"/>
-            </w:tcMar>
-          </w:tcPr>
-          <w:p>
-            <w:r>
-              <w:rPr>
-                <w:rFonts w:ascii="Calibri" w:cs="Calibri" w:eastAsia="Calibri" w:hAnsi="Calibri"/>
-                <w:color w:val="0F172A"/>
-                <w:sz w:val="19"/>
-                <w:szCs w:val="19"/>
-              </w:rPr>
-              <w:t xml:space="preserve">features/quest/HintModal.jsx</w:t>
+              <w:t xml:space="preserve">Skip Question Option</w:t>
+            </w:r>
+          </w:p>
+        </w:tc>
+        <w:tc>
+          <w:tcPr>
+            <w:shd w:fill="FFFFFF" w:val="clear"/>
+            <w:tcMar>
+              <w:top w:type="dxa" w:w="100"/>
+              <w:left w:type="dxa" w:w="140"/>
+              <w:bottom w:type="dxa" w:w="100"/>
+              <w:right w:type="dxa" w:w="140"/>
+            </w:tcMar>
+          </w:tcPr>
+          <w:p>
+            <w:r>
+              <w:rPr>
+                <w:rFonts w:ascii="Calibri" w:cs="Calibri" w:eastAsia="Calibri" w:hAnsi="Calibri"/>
+                <w:color w:val="0F172A"/>
+                <w:sz w:val="19"/>
+                <w:szCs w:val="19"/>
+              </w:rPr>
+              <w:t xml:space="preserve">Allows explorer to skip unfamiliar questions; records skips in score report without penalty.</w:t>
+            </w:r>
+          </w:p>
+        </w:tc>
+        <w:tc>
+          <w:tcPr>
+            <w:shd w:fill="FFFFFF" w:val="clear"/>
+            <w:tcMar>
+              <w:top w:type="dxa" w:w="100"/>
+              <w:left w:type="dxa" w:w="140"/>
+              <w:bottom w:type="dxa" w:w="100"/>
+              <w:right w:type="dxa" w:w="140"/>
+            </w:tcMar>
+          </w:tcPr>
+          <w:p>
+            <w:r>
+              <w:rPr>
+                <w:rFonts w:ascii="Calibri" w:cs="Calibri" w:eastAsia="Calibri" w:hAnsi="Calibri"/>
+                <w:color w:val="0F172A"/>
+                <w:sz w:val="19"/>
+                <w:szCs w:val="19"/>
+              </w:rPr>
+              <w:t xml:space="preserve">SkipForward (⏭️) button in bottom action bar.</w:t>
+            </w:r>
+          </w:p>
+        </w:tc>
+        <w:tc>
+          <w:tcPr>
+            <w:shd w:fill="FFFFFF" w:val="clear"/>
+            <w:tcMar>
+              <w:top w:type="dxa" w:w="100"/>
+              <w:left w:type="dxa" w:w="140"/>
+              <w:bottom w:type="dxa" w:w="100"/>
+              <w:right w:type="dxa" w:w="140"/>
+            </w:tcMar>
+          </w:tcPr>
+          <w:p>
+            <w:r>
+              <w:rPr>
+                <w:rFonts w:ascii="Calibri" w:cs="Calibri" w:eastAsia="Calibri" w:hAnsi="Calibri"/>
+                <w:color w:val="0F172A"/>
+                <w:sz w:val="19"/>
+                <w:szCs w:val="19"/>
+              </w:rPr>
+              <w:t xml:space="preserve">features/quest/QuestionCard.jsx</w:t>
             </w:r>
           </w:p>
         </w:tc>
@@ -6001,7 +6001,7 @@
                 <w:sz w:val="19"/>
                 <w:szCs w:val="19"/>
               </w:rPr>
-              <w:t xml:space="preserve">AI Tutor Doubt Explainer</w:t>
+              <w:t xml:space="preserve">Cognitive Hint Modal</w:t>
             </w:r>
           </w:p>
         </w:tc>
@@ -6023,7 +6023,7 @@
                 <w:sz w:val="19"/>
                 <w:szCs w:val="19"/>
               </w:rPr>
-              <w:t xml:space="preserve">Explains confusing concepts interactively using friendly space-tutor persona prompts.</w:t>
+              <w:t xml:space="preserve">Opens age-appropriate hints to guide the explorer without giving away the direct answer.</w:t>
             </w:r>
           </w:p>
         </w:tc>
@@ -6045,7 +6045,7 @@
                 <w:sz w:val="19"/>
                 <w:szCs w:val="19"/>
               </w:rPr>
-              <w:t xml:space="preserve">Ask Space Tutor (🤖) button on solution reveal.</w:t>
+              <w:t xml:space="preserve">Zap (⚡) hint button in bottom action bar.</w:t>
             </w:r>
           </w:p>
         </w:tc>
@@ -6067,7 +6067,7 @@
                 <w:sz w:val="19"/>
                 <w:szCs w:val="19"/>
               </w:rPr>
-              <w:t xml:space="preserve">features/quest/AskDoubtModal.jsx</w:t>
+              <w:t xml:space="preserve">features/quest/HintModal.jsx</w:t>
             </w:r>
           </w:p>
         </w:tc>
@@ -6091,73 +6091,73 @@
                 <w:sz w:val="19"/>
                 <w:szCs w:val="19"/>
               </w:rPr>
-              <w:t xml:space="preserve">Streamlined Exit Workflow</w:t>
-            </w:r>
-          </w:p>
-        </w:tc>
-        <w:tc>
-          <w:tcPr>
-            <w:shd w:fill="FFFFFF" w:val="clear"/>
-            <w:tcMar>
-              <w:top w:type="dxa" w:w="100"/>
-              <w:left w:type="dxa" w:w="140"/>
-              <w:bottom w:type="dxa" w:w="100"/>
-              <w:right w:type="dxa" w:w="140"/>
-            </w:tcMar>
-          </w:tcPr>
-          <w:p>
-            <w:r>
-              <w:rPr>
-                <w:rFonts w:ascii="Calibri" w:cs="Calibri" w:eastAsia="Calibri" w:hAnsi="Calibri"/>
-                <w:color w:val="0F172A"/>
-                <w:sz w:val="19"/>
-                <w:szCs w:val="19"/>
-              </w:rPr>
-              <w:t xml:space="preserve">Confirms mid-quiz exits safely without generating incomplete or premature PDF reports.</w:t>
-            </w:r>
-          </w:p>
-        </w:tc>
-        <w:tc>
-          <w:tcPr>
-            <w:shd w:fill="FFFFFF" w:val="clear"/>
-            <w:tcMar>
-              <w:top w:type="dxa" w:w="100"/>
-              <w:left w:type="dxa" w:w="140"/>
-              <w:bottom w:type="dxa" w:w="100"/>
-              <w:right w:type="dxa" w:w="140"/>
-            </w:tcMar>
-          </w:tcPr>
-          <w:p>
-            <w:r>
-              <w:rPr>
-                <w:rFonts w:ascii="Calibri" w:cs="Calibri" w:eastAsia="Calibri" w:hAnsi="Calibri"/>
-                <w:color w:val="0F172A"/>
-                <w:sz w:val="19"/>
-                <w:szCs w:val="19"/>
-              </w:rPr>
-              <w:t xml:space="preserve">Exit button in top navigation bar.</w:t>
-            </w:r>
-          </w:p>
-        </w:tc>
-        <w:tc>
-          <w:tcPr>
-            <w:shd w:fill="FFFFFF" w:val="clear"/>
-            <w:tcMar>
-              <w:top w:type="dxa" w:w="100"/>
-              <w:left w:type="dxa" w:w="140"/>
-              <w:bottom w:type="dxa" w:w="100"/>
-              <w:right w:type="dxa" w:w="140"/>
-            </w:tcMar>
-          </w:tcPr>
-          <w:p>
-            <w:r>
-              <w:rPr>
-                <w:rFonts w:ascii="Calibri" w:cs="Calibri" w:eastAsia="Calibri" w:hAnsi="Calibri"/>
-                <w:color w:val="0F172A"/>
-                <w:sz w:val="19"/>
-                <w:szCs w:val="19"/>
-              </w:rPr>
-              <w:t xml:space="preserve">features/quest/ExitConfirmationModal.jsx</w:t>
+              <w:t xml:space="preserve">AI Tutor Doubt Explainer</w:t>
+            </w:r>
+          </w:p>
+        </w:tc>
+        <w:tc>
+          <w:tcPr>
+            <w:shd w:fill="FFFFFF" w:val="clear"/>
+            <w:tcMar>
+              <w:top w:type="dxa" w:w="100"/>
+              <w:left w:type="dxa" w:w="140"/>
+              <w:bottom w:type="dxa" w:w="100"/>
+              <w:right w:type="dxa" w:w="140"/>
+            </w:tcMar>
+          </w:tcPr>
+          <w:p>
+            <w:r>
+              <w:rPr>
+                <w:rFonts w:ascii="Calibri" w:cs="Calibri" w:eastAsia="Calibri" w:hAnsi="Calibri"/>
+                <w:color w:val="0F172A"/>
+                <w:sz w:val="19"/>
+                <w:szCs w:val="19"/>
+              </w:rPr>
+              <w:t xml:space="preserve">Explains confusing concepts interactively using friendly space-tutor persona prompts.</w:t>
+            </w:r>
+          </w:p>
+        </w:tc>
+        <w:tc>
+          <w:tcPr>
+            <w:shd w:fill="FFFFFF" w:val="clear"/>
+            <w:tcMar>
+              <w:top w:type="dxa" w:w="100"/>
+              <w:left w:type="dxa" w:w="140"/>
+              <w:bottom w:type="dxa" w:w="100"/>
+              <w:right w:type="dxa" w:w="140"/>
+            </w:tcMar>
+          </w:tcPr>
+          <w:p>
+            <w:r>
+              <w:rPr>
+                <w:rFonts w:ascii="Calibri" w:cs="Calibri" w:eastAsia="Calibri" w:hAnsi="Calibri"/>
+                <w:color w:val="0F172A"/>
+                <w:sz w:val="19"/>
+                <w:szCs w:val="19"/>
+              </w:rPr>
+              <w:t xml:space="preserve">Ask Space Tutor (🤖) button on solution reveal.</w:t>
+            </w:r>
+          </w:p>
+        </w:tc>
+        <w:tc>
+          <w:tcPr>
+            <w:shd w:fill="FFFFFF" w:val="clear"/>
+            <w:tcMar>
+              <w:top w:type="dxa" w:w="100"/>
+              <w:left w:type="dxa" w:w="140"/>
+              <w:bottom w:type="dxa" w:w="100"/>
+              <w:right w:type="dxa" w:w="140"/>
+            </w:tcMar>
+          </w:tcPr>
+          <w:p>
+            <w:r>
+              <w:rPr>
+                <w:rFonts w:ascii="Calibri" w:cs="Calibri" w:eastAsia="Calibri" w:hAnsi="Calibri"/>
+                <w:color w:val="0F172A"/>
+                <w:sz w:val="19"/>
+                <w:szCs w:val="19"/>
+              </w:rPr>
+              <w:t xml:space="preserve">features/quest/AskDoubtModal.jsx</w:t>
             </w:r>
           </w:p>
         </w:tc>
@@ -6181,7 +6181,7 @@
                 <w:sz w:val="19"/>
                 <w:szCs w:val="19"/>
               </w:rPr>
-              <w:t xml:space="preserve">Multi-Page PDF Report</w:t>
+              <w:t xml:space="preserve">Streamlined Exit Workflow</w:t>
             </w:r>
           </w:p>
         </w:tc>
@@ -6203,7 +6203,7 @@
                 <w:sz w:val="19"/>
                 <w:szCs w:val="19"/>
               </w:rPr>
-              <w:t xml:space="preserve">Generates personalized multi-page PDF session summary with integrated header score &amp; options.</w:t>
+              <w:t xml:space="preserve">Confirms mid-quiz exits safely without generating incomplete or premature PDF reports.</w:t>
             </w:r>
           </w:p>
         </w:tc>
@@ -6225,7 +6225,7 @@
                 <w:sz w:val="19"/>
                 <w:szCs w:val="19"/>
               </w:rPr>
-              <w:t xml:space="preserve">Download PDF Report (📄) button on Results page.</w:t>
+              <w:t xml:space="preserve">Exit button in top navigation bar.</w:t>
             </w:r>
           </w:p>
         </w:tc>
@@ -6247,7 +6247,7 @@
                 <w:sz w:val="19"/>
                 <w:szCs w:val="19"/>
               </w:rPr>
-              <w:t xml:space="preserve">utils/pdfGenerator.js</w:t>
+              <w:t xml:space="preserve">features/quest/ExitConfirmationModal.jsx</w:t>
             </w:r>
           </w:p>
         </w:tc>
@@ -6271,73 +6271,73 @@
                 <w:sz w:val="19"/>
                 <w:szCs w:val="19"/>
               </w:rPr>
-              <w:t xml:space="preserve">Cosmic Error Boundary</w:t>
-            </w:r>
-          </w:p>
-        </w:tc>
-        <w:tc>
-          <w:tcPr>
-            <w:shd w:fill="FFFFFF" w:val="clear"/>
-            <w:tcMar>
-              <w:top w:type="dxa" w:w="100"/>
-              <w:left w:type="dxa" w:w="140"/>
-              <w:bottom w:type="dxa" w:w="100"/>
-              <w:right w:type="dxa" w:w="140"/>
-            </w:tcMar>
-          </w:tcPr>
-          <w:p>
-            <w:r>
-              <w:rPr>
-                <w:rFonts w:ascii="Calibri" w:cs="Calibri" w:eastAsia="Calibri" w:hAnsi="Calibri"/>
-                <w:color w:val="0F172A"/>
-                <w:sz w:val="19"/>
-                <w:szCs w:val="19"/>
-              </w:rPr>
-              <w:t xml:space="preserve">Shields application from runtime crashes with kid-friendly recovery and clipboard error copying.</w:t>
-            </w:r>
-          </w:p>
-        </w:tc>
-        <w:tc>
-          <w:tcPr>
-            <w:shd w:fill="FFFFFF" w:val="clear"/>
-            <w:tcMar>
-              <w:top w:type="dxa" w:w="100"/>
-              <w:left w:type="dxa" w:w="140"/>
-              <w:bottom w:type="dxa" w:w="100"/>
-              <w:right w:type="dxa" w:w="140"/>
-            </w:tcMar>
-          </w:tcPr>
-          <w:p>
-            <w:r>
-              <w:rPr>
-                <w:rFonts w:ascii="Calibri" w:cs="Calibri" w:eastAsia="Calibri" w:hAnsi="Calibri"/>
-                <w:color w:val="0F172A"/>
-                <w:sz w:val="19"/>
-                <w:szCs w:val="19"/>
-              </w:rPr>
-              <w:t xml:space="preserve">Refresh &amp; Continue, Reset Cache, Copy Error Details.</w:t>
-            </w:r>
-          </w:p>
-        </w:tc>
-        <w:tc>
-          <w:tcPr>
-            <w:shd w:fill="FFFFFF" w:val="clear"/>
-            <w:tcMar>
-              <w:top w:type="dxa" w:w="100"/>
-              <w:left w:type="dxa" w:w="140"/>
-              <w:bottom w:type="dxa" w:w="100"/>
-              <w:right w:type="dxa" w:w="140"/>
-            </w:tcMar>
-          </w:tcPr>
-          <w:p>
-            <w:r>
-              <w:rPr>
-                <w:rFonts w:ascii="Calibri" w:cs="Calibri" w:eastAsia="Calibri" w:hAnsi="Calibri"/>
-                <w:color w:val="0F172A"/>
-                <w:sz w:val="19"/>
-                <w:szCs w:val="19"/>
-              </w:rPr>
-              <w:t xml:space="preserve">utils/ErrorBoundary.jsx</w:t>
+              <w:t xml:space="preserve">Multi-Page PDF Report</w:t>
+            </w:r>
+          </w:p>
+        </w:tc>
+        <w:tc>
+          <w:tcPr>
+            <w:shd w:fill="FFFFFF" w:val="clear"/>
+            <w:tcMar>
+              <w:top w:type="dxa" w:w="100"/>
+              <w:left w:type="dxa" w:w="140"/>
+              <w:bottom w:type="dxa" w:w="100"/>
+              <w:right w:type="dxa" w:w="140"/>
+            </w:tcMar>
+          </w:tcPr>
+          <w:p>
+            <w:r>
+              <w:rPr>
+                <w:rFonts w:ascii="Calibri" w:cs="Calibri" w:eastAsia="Calibri" w:hAnsi="Calibri"/>
+                <w:color w:val="0F172A"/>
+                <w:sz w:val="19"/>
+                <w:szCs w:val="19"/>
+              </w:rPr>
+              <w:t xml:space="preserve">Generates personalized multi-page PDF session summary with integrated header score &amp; options.</w:t>
+            </w:r>
+          </w:p>
+        </w:tc>
+        <w:tc>
+          <w:tcPr>
+            <w:shd w:fill="FFFFFF" w:val="clear"/>
+            <w:tcMar>
+              <w:top w:type="dxa" w:w="100"/>
+              <w:left w:type="dxa" w:w="140"/>
+              <w:bottom w:type="dxa" w:w="100"/>
+              <w:right w:type="dxa" w:w="140"/>
+            </w:tcMar>
+          </w:tcPr>
+          <w:p>
+            <w:r>
+              <w:rPr>
+                <w:rFonts w:ascii="Calibri" w:cs="Calibri" w:eastAsia="Calibri" w:hAnsi="Calibri"/>
+                <w:color w:val="0F172A"/>
+                <w:sz w:val="19"/>
+                <w:szCs w:val="19"/>
+              </w:rPr>
+              <w:t xml:space="preserve">Download PDF Report (📄) button on Results page.</w:t>
+            </w:r>
+          </w:p>
+        </w:tc>
+        <w:tc>
+          <w:tcPr>
+            <w:shd w:fill="FFFFFF" w:val="clear"/>
+            <w:tcMar>
+              <w:top w:type="dxa" w:w="100"/>
+              <w:left w:type="dxa" w:w="140"/>
+              <w:bottom w:type="dxa" w:w="100"/>
+              <w:right w:type="dxa" w:w="140"/>
+            </w:tcMar>
+          </w:tcPr>
+          <w:p>
+            <w:r>
+              <w:rPr>
+                <w:rFonts w:ascii="Calibri" w:cs="Calibri" w:eastAsia="Calibri" w:hAnsi="Calibri"/>
+                <w:color w:val="0F172A"/>
+                <w:sz w:val="19"/>
+                <w:szCs w:val="19"/>
+              </w:rPr>
+              <w:t xml:space="preserve">utils/pdfGenerator.js</w:t>
             </w:r>
           </w:p>
         </w:tc>
@@ -6361,13 +6361,103 @@
                 <w:sz w:val="19"/>
                 <w:szCs w:val="19"/>
               </w:rPr>
+              <w:t xml:space="preserve">Cosmic Error Boundary</w:t>
+            </w:r>
+          </w:p>
+        </w:tc>
+        <w:tc>
+          <w:tcPr>
+            <w:shd w:fill="F8FAFC" w:val="clear"/>
+            <w:tcMar>
+              <w:top w:type="dxa" w:w="100"/>
+              <w:left w:type="dxa" w:w="140"/>
+              <w:bottom w:type="dxa" w:w="100"/>
+              <w:right w:type="dxa" w:w="140"/>
+            </w:tcMar>
+          </w:tcPr>
+          <w:p>
+            <w:r>
+              <w:rPr>
+                <w:rFonts w:ascii="Calibri" w:cs="Calibri" w:eastAsia="Calibri" w:hAnsi="Calibri"/>
+                <w:color w:val="0F172A"/>
+                <w:sz w:val="19"/>
+                <w:szCs w:val="19"/>
+              </w:rPr>
+              <w:t xml:space="preserve">Shields application from runtime crashes with kid-friendly recovery and clipboard error copying.</w:t>
+            </w:r>
+          </w:p>
+        </w:tc>
+        <w:tc>
+          <w:tcPr>
+            <w:shd w:fill="F8FAFC" w:val="clear"/>
+            <w:tcMar>
+              <w:top w:type="dxa" w:w="100"/>
+              <w:left w:type="dxa" w:w="140"/>
+              <w:bottom w:type="dxa" w:w="100"/>
+              <w:right w:type="dxa" w:w="140"/>
+            </w:tcMar>
+          </w:tcPr>
+          <w:p>
+            <w:r>
+              <w:rPr>
+                <w:rFonts w:ascii="Calibri" w:cs="Calibri" w:eastAsia="Calibri" w:hAnsi="Calibri"/>
+                <w:color w:val="0F172A"/>
+                <w:sz w:val="19"/>
+                <w:szCs w:val="19"/>
+              </w:rPr>
+              <w:t xml:space="preserve">Refresh &amp; Continue, Reset Cache, Copy Error Details.</w:t>
+            </w:r>
+          </w:p>
+        </w:tc>
+        <w:tc>
+          <w:tcPr>
+            <w:shd w:fill="F8FAFC" w:val="clear"/>
+            <w:tcMar>
+              <w:top w:type="dxa" w:w="100"/>
+              <w:left w:type="dxa" w:w="140"/>
+              <w:bottom w:type="dxa" w:w="100"/>
+              <w:right w:type="dxa" w:w="140"/>
+            </w:tcMar>
+          </w:tcPr>
+          <w:p>
+            <w:r>
+              <w:rPr>
+                <w:rFonts w:ascii="Calibri" w:cs="Calibri" w:eastAsia="Calibri" w:hAnsi="Calibri"/>
+                <w:color w:val="0F172A"/>
+                <w:sz w:val="19"/>
+                <w:szCs w:val="19"/>
+              </w:rPr>
+              <w:t xml:space="preserve">utils/ErrorBoundary.jsx</w:t>
+            </w:r>
+          </w:p>
+        </w:tc>
+      </w:tr>
+      <w:tr>
+        <w:tc>
+          <w:tcPr>
+            <w:shd w:fill="FFFFFF" w:val="clear"/>
+            <w:tcMar>
+              <w:top w:type="dxa" w:w="100"/>
+              <w:left w:type="dxa" w:w="140"/>
+              <w:bottom w:type="dxa" w:w="100"/>
+              <w:right w:type="dxa" w:w="140"/>
+            </w:tcMar>
+          </w:tcPr>
+          <w:p>
+            <w:r>
+              <w:rPr>
+                <w:rFonts w:ascii="Calibri" w:cs="Calibri" w:eastAsia="Calibri" w:hAnsi="Calibri"/>
+                <w:color w:val="0F172A"/>
+                <w:sz w:val="19"/>
+                <w:szCs w:val="19"/>
+              </w:rPr>
               <w:t xml:space="preserve">Network Retry Middleware</w:t>
             </w:r>
           </w:p>
         </w:tc>
         <w:tc>
           <w:tcPr>
-            <w:shd w:fill="F8FAFC" w:val="clear"/>
+            <w:shd w:fill="FFFFFF" w:val="clear"/>
             <w:tcMar>
               <w:top w:type="dxa" w:w="100"/>
               <w:left w:type="dxa" w:w="140"/>
@@ -6389,7 +6479,7 @@
         </w:tc>
         <w:tc>
           <w:tcPr>
-            <w:shd w:fill="F8FAFC" w:val="clear"/>
+            <w:shd w:fill="FFFFFF" w:val="clear"/>
             <w:tcMar>
               <w:top w:type="dxa" w:w="100"/>
               <w:left w:type="dxa" w:w="140"/>
@@ -6411,7 +6501,7 @@
         </w:tc>
         <w:tc>
           <w:tcPr>
-            <w:shd w:fill="F8FAFC" w:val="clear"/>
+            <w:shd w:fill="FFFFFF" w:val="clear"/>
             <w:tcMar>
               <w:top w:type="dxa" w:w="100"/>
               <w:left w:type="dxa" w:w="140"/>

</xml_diff>

<commit_message>
docs: regenerate docx documentation with latest architectural and feature changes
</commit_message>
<xml_diff>
--- a/documentation/AstroQuest_Implementation_Documentation.docx
+++ b/documentation/AstroQuest_Implementation_Documentation.docx
@@ -1776,7 +1776,7 @@
           <w:sz w:val="18"/>
           <w:szCs w:val="18"/>
         </w:rPr>
-        <w:t xml:space="preserve">  | 2. SETTINGS SCREEN           |        | 3. QUESTION PIPELINE           |</w:t>
+        <w:t xml:space="preserve">  | 2. SETTINGS SCREEN           |        | 3. QUESTION SYNTHESIS PIPELINE |</w:t>
       </w:r>
     </w:p>
     <w:p>
@@ -1851,7 +1851,22 @@
           <w:sz w:val="18"/>
           <w:szCs w:val="18"/>
         </w:rPr>
-        <w:t xml:space="preserve">  +--------------+---------------+        +-----+--------------------------+</w:t>
+        <w:t xml:space="preserve">  |    - Dirty-State Guard       |        +-----+--------------------------+</w:t>
+      </w:r>
+    </w:p>
+    <w:p>
+      <w:pPr>
+        <w:shd w:fill="F1F5F9" w:val="clear"/>
+        <w:spacing w:after="20" w:before="20"/>
+      </w:pPr>
+      <w:r>
+        <w:rPr>
+          <w:rFonts w:ascii="Consolas" w:cs="Consolas" w:eastAsia="Consolas" w:hAnsi="Consolas"/>
+          <w:color w:val="0F172A"/>
+          <w:sz w:val="18"/>
+          <w:szCs w:val="18"/>
+        </w:rPr>
+        <w:t xml:space="preserve">  +--------------+---------------+              |</w:t>
       </w:r>
     </w:p>
     <w:p>
@@ -1926,7 +1941,127 @@
           <w:sz w:val="18"/>
           <w:szCs w:val="18"/>
         </w:rPr>
-        <w:t xml:space="preserve">  | 4. INTERACTIVE QUEST INTERFACE (App.jsx)                               |</w:t>
+        <w:t xml:space="preserve">  | 4. COSMIC QUEST LOADER (CosmicQuestLoader.jsx)                         |</w:t>
+      </w:r>
+    </w:p>
+    <w:p>
+      <w:pPr>
+        <w:shd w:fill="F1F5F9" w:val="clear"/>
+        <w:spacing w:after="20" w:before="20"/>
+      </w:pPr>
+      <w:r>
+        <w:rPr>
+          <w:rFonts w:ascii="Consolas" w:cs="Consolas" w:eastAsia="Consolas" w:hAnsi="Consolas"/>
+          <w:color w:val="0F172A"/>
+          <w:sz w:val="18"/>
+          <w:szCs w:val="18"/>
+        </w:rPr>
+        <w:t xml:space="preserve">  |    - Dynamic Explorer Name &amp; Age binding (Settings Storage)            |</w:t>
+      </w:r>
+    </w:p>
+    <w:p>
+      <w:pPr>
+        <w:shd w:fill="F1F5F9" w:val="clear"/>
+        <w:spacing w:after="20" w:before="20"/>
+      </w:pPr>
+      <w:r>
+        <w:rPr>
+          <w:rFonts w:ascii="Consolas" w:cs="Consolas" w:eastAsia="Consolas" w:hAnsi="Consolas"/>
+          <w:color w:val="0F172A"/>
+          <w:sz w:val="18"/>
+          <w:szCs w:val="18"/>
+        </w:rPr>
+        <w:t xml:space="preserve">  |    - Adaptive Skillset Theming: Visual (Eye) vs Analytical (Brain)     |</w:t>
+      </w:r>
+    </w:p>
+    <w:p>
+      <w:pPr>
+        <w:shd w:fill="F1F5F9" w:val="clear"/>
+        <w:spacing w:after="20" w:before="20"/>
+      </w:pPr>
+      <w:r>
+        <w:rPr>
+          <w:rFonts w:ascii="Consolas" w:cs="Consolas" w:eastAsia="Consolas" w:hAnsi="Consolas"/>
+          <w:color w:val="0F172A"/>
+          <w:sz w:val="18"/>
+          <w:szCs w:val="18"/>
+        </w:rPr>
+        <w:t xml:space="preserve">  |    - Orbiting vector space rocket, radar pulses, &amp; warp energy gauge   |</w:t>
+      </w:r>
+    </w:p>
+    <w:p>
+      <w:pPr>
+        <w:shd w:fill="F1F5F9" w:val="clear"/>
+        <w:spacing w:after="20" w:before="20"/>
+      </w:pPr>
+      <w:r>
+        <w:rPr>
+          <w:rFonts w:ascii="Consolas" w:cs="Consolas" w:eastAsia="Consolas" w:hAnsi="Consolas"/>
+          <w:color w:val="0F172A"/>
+          <w:sz w:val="18"/>
+          <w:szCs w:val="18"/>
+        </w:rPr>
+        <w:t xml:space="preserve">  |    - Rotating mission telemetry steps &amp; live link status               |</w:t>
+      </w:r>
+    </w:p>
+    <w:p>
+      <w:pPr>
+        <w:shd w:fill="F1F5F9" w:val="clear"/>
+        <w:spacing w:after="20" w:before="20"/>
+      </w:pPr>
+      <w:r>
+        <w:rPr>
+          <w:rFonts w:ascii="Consolas" w:cs="Consolas" w:eastAsia="Consolas" w:hAnsi="Consolas"/>
+          <w:color w:val="0F172A"/>
+          <w:sz w:val="18"/>
+          <w:szCs w:val="18"/>
+        </w:rPr>
+        <w:t xml:space="preserve">  +---------------------------------------------+--------------------------+</w:t>
+      </w:r>
+    </w:p>
+    <w:p>
+      <w:pPr>
+        <w:shd w:fill="F1F5F9" w:val="clear"/>
+        <w:spacing w:after="20" w:before="20"/>
+      </w:pPr>
+      <w:r>
+        <w:rPr>
+          <w:rFonts w:ascii="Consolas" w:cs="Consolas" w:eastAsia="Consolas" w:hAnsi="Consolas"/>
+          <w:color w:val="0F172A"/>
+          <w:sz w:val="18"/>
+          <w:szCs w:val="18"/>
+        </w:rPr>
+        <w:t xml:space="preserve">                                                | [Synthesis Complete]</w:t>
+      </w:r>
+    </w:p>
+    <w:p>
+      <w:pPr>
+        <w:shd w:fill="F1F5F9" w:val="clear"/>
+        <w:spacing w:after="20" w:before="20"/>
+      </w:pPr>
+      <w:r>
+        <w:rPr>
+          <w:rFonts w:ascii="Consolas" w:cs="Consolas" w:eastAsia="Consolas" w:hAnsi="Consolas"/>
+          <w:color w:val="0F172A"/>
+          <w:sz w:val="18"/>
+          <w:szCs w:val="18"/>
+        </w:rPr>
+        <w:t xml:space="preserve">  +---------------------------------------------v--------------------------+</w:t>
+      </w:r>
+    </w:p>
+    <w:p>
+      <w:pPr>
+        <w:shd w:fill="F1F5F9" w:val="clear"/>
+        <w:spacing w:after="20" w:before="20"/>
+      </w:pPr>
+      <w:r>
+        <w:rPr>
+          <w:rFonts w:ascii="Consolas" w:cs="Consolas" w:eastAsia="Consolas" w:hAnsi="Consolas"/>
+          <w:color w:val="0F172A"/>
+          <w:sz w:val="18"/>
+          <w:szCs w:val="18"/>
+        </w:rPr>
+        <w:t xml:space="preserve">  | 5. INTERACTIVE QUEST INTERFACE (App.jsx)                               |</w:t>
       </w:r>
     </w:p>
     <w:p>
@@ -3675,7 +3810,7 @@
           <w:sz w:val="26"/>
           <w:szCs w:val="26"/>
         </w:rPr>
-        <w:t xml:space="preserve">4.4 Mathematical SVG Shape Engine (src/utils/shapeGenerator.jsx)</w:t>
+        <w:t xml:space="preserve">4.4 Mathematical SVG Shape Engine &amp; Deduplication (src/utils/shapeGenerator.jsx)</w:t>
       </w:r>
     </w:p>
     <w:p>
@@ -3740,16 +3875,16 @@
           <w:sz w:val="20"/>
           <w:szCs w:val="20"/>
         </w:rPr>
-        <w:t xml:space="preserve">Injects SVG &lt;defs&gt; containing &lt;pattern id="...-striped"&gt; with 45-degree diagonal lines and &lt;pattern id="...-dotted"&gt; with radial dot arrays.: </w:t>
-      </w:r>
-      <w:r>
-        <w:rPr>
-          <w:rFonts w:ascii="Calibri" w:cs="Calibri" w:eastAsia="Calibri" w:hAnsi="Calibri"/>
-          <w:color w:val="0F172A"/>
-          <w:sz w:val="20"/>
-          <w:szCs w:val="20"/>
-        </w:rPr>
-        <w:t xml:space="preserve">Vector Hatching &amp; Patterns</w:t>
+        <w:t xml:space="preserve">Implemented a smooth cubic Bezier vector crescent moon curve in DynamicSvgShape and decoupled 0-sided shapes (moon, sun, heart) from circle intercept conditions, rendering scalable vector art for celestial patterns.: </w:t>
+      </w:r>
+      <w:r>
+        <w:rPr>
+          <w:rFonts w:ascii="Calibri" w:cs="Calibri" w:eastAsia="Calibri" w:hAnsi="Calibri"/>
+          <w:color w:val="0F172A"/>
+          <w:sz w:val="20"/>
+          <w:szCs w:val="20"/>
+        </w:rPr>
+        <w:t xml:space="preserve">Vector Crescent Moon &amp; Celestial Geometries</w:t>
       </w:r>
     </w:p>
     <w:p>
@@ -3770,16 +3905,16 @@
           <w:sz w:val="20"/>
           <w:szCs w:val="20"/>
         </w:rPr>
-        <w:t xml:space="preserve">parseMatrixGridFromQuestion extracts Row 1, Row 2, and Row 3 descriptions from question text, populating a 9-cell grid with interactive question marks and emerald solution highlights.: </w:t>
-      </w:r>
-      <w:r>
-        <w:rPr>
-          <w:rFonts w:ascii="Calibri" w:cs="Calibri" w:eastAsia="Calibri" w:hAnsi="Calibri"/>
-          <w:color w:val="0F172A"/>
-          <w:sz w:val="20"/>
-          <w:szCs w:val="20"/>
-        </w:rPr>
-        <w:t xml:space="preserve">3x3 Matrix Grid Parser</w:t>
+        <w:t xml:space="preserve">Directly extracts and normalizes celestial emojis (moon, sun, lightning, cloud), hearts, stars, and geometric blocks into structured shape objects with appropriate theme color mappings.: </w:t>
+      </w:r>
+      <w:r>
+        <w:rPr>
+          <w:rFonts w:ascii="Calibri" w:cs="Calibri" w:eastAsia="Calibri" w:hAnsi="Calibri"/>
+          <w:color w:val="0F172A"/>
+          <w:sz w:val="20"/>
+          <w:szCs w:val="20"/>
+        </w:rPr>
+        <w:t xml:space="preserve">Comprehensive Emoji Parser (parseDynamicShape)</w:t>
       </w:r>
     </w:p>
     <w:p>
@@ -3800,16 +3935,16 @@
           <w:sz w:val="20"/>
           <w:szCs w:val="20"/>
         </w:rPr>
-        <w:t xml:space="preserve">Computes isometric projections with depth-sorted back-to-front rendering and dynamic face shading (top: light, left: medium, right: dark).: </w:t>
-      </w:r>
-      <w:r>
-        <w:rPr>
-          <w:rFonts w:ascii="Calibri" w:cs="Calibri" w:eastAsia="Calibri" w:hAnsi="Calibri"/>
-          <w:color w:val="0F172A"/>
-          <w:sz w:val="20"/>
-          <w:szCs w:val="20"/>
-        </w:rPr>
-        <w:t xml:space="preserve">3D Isometric Cube Towers</w:t>
+        <w:t xml:space="preserve">Ensures that card headers and text subtitles never redundantly repeat identical emoji symbols, displaying clean deduplicated labels (e.g. Gold Star, Gold Moon).: </w:t>
+      </w:r>
+      <w:r>
+        <w:rPr>
+          <w:rFonts w:ascii="Calibri" w:cs="Calibri" w:eastAsia="Calibri" w:hAnsi="Calibri"/>
+          <w:color w:val="0F172A"/>
+          <w:sz w:val="20"/>
+          <w:szCs w:val="20"/>
+        </w:rPr>
+        <w:t xml:space="preserve">Label Deduplication Safeguard (DynamicShapeCard)</w:t>
       </w:r>
     </w:p>
     <w:p>
@@ -3830,47 +3965,16 @@
           <w:sz w:val="20"/>
           <w:szCs w:val="20"/>
         </w:rPr>
-        <w:t xml:space="preserve">Renders a glass prism bending incident white light into a 7-color rainbow spectrum with step-by-step ray physics.: </w:t>
-      </w:r>
-      <w:r>
-        <w:rPr>
-          <w:rFonts w:ascii="Calibri" w:cs="Calibri" w:eastAsia="Calibri" w:hAnsi="Calibri"/>
-          <w:color w:val="0F172A"/>
-          <w:sz w:val="20"/>
-          <w:szCs w:val="20"/>
-        </w:rPr>
-        <w:t xml:space="preserve">Optics Dispersion Prism</w:t>
-      </w:r>
-    </w:p>
-    <w:p>
-      <w:pPr>
-        <w:pStyle w:val="Heading2"/>
-        <w:spacing w:after="120" w:before="280"/>
-      </w:pPr>
-      <w:r>
-        <w:rPr>
-          <w:rFonts w:ascii="Calibri" w:cs="Calibri" w:eastAsia="Calibri" w:hAnsi="Calibri"/>
-          <w:b/>
-          <w:bCs/>
-          <w:color w:val="312E81"/>
-          <w:sz w:val="26"/>
-          <w:szCs w:val="26"/>
-        </w:rPr>
-        <w:t xml:space="preserve">4.5 Question Generation &amp; Deduplication Engine (src/services/aiGenerator.js)</w:t>
-      </w:r>
-    </w:p>
-    <w:p>
-      <w:pPr>
-        <w:spacing w:after="100" w:before="60" w:line="276"/>
-      </w:pPr>
-      <w:r>
-        <w:rPr>
-          <w:rFonts w:ascii="Calibri" w:cs="Calibri" w:eastAsia="Calibri" w:hAnsi="Calibri"/>
-          <w:color w:val="0F172A"/>
-          <w:sz w:val="21"/>
-          <w:szCs w:val="21"/>
-        </w:rPr>
-        <w:t xml:space="preserve">The question generation pipeline guarantees 10 unique, strictly age-calibrated questions per session.</w:t>
+        <w:t xml:space="preserve">Injects SVG &lt;defs&gt; containing &lt;pattern id="...-striped"&gt; with 45-degree diagonal lines and &lt;pattern id="...-dotted"&gt; with radial dot arrays.: </w:t>
+      </w:r>
+      <w:r>
+        <w:rPr>
+          <w:rFonts w:ascii="Calibri" w:cs="Calibri" w:eastAsia="Calibri" w:hAnsi="Calibri"/>
+          <w:color w:val="0F172A"/>
+          <w:sz w:val="20"/>
+          <w:szCs w:val="20"/>
+        </w:rPr>
+        <w:t xml:space="preserve">Vector Hatching &amp; Patterns</w:t>
       </w:r>
     </w:p>
     <w:p>
@@ -3891,16 +3995,16 @@
           <w:sz w:val="20"/>
           <w:szCs w:val="20"/>
         </w:rPr>
-        <w:t xml:space="preserve">Fires two simultaneous requests for 6 questions each (12 total buffer) divided into pedagogical sub-domains (e.g. Batch 1: analogies &amp; riddles; Batch 2: sequences &amp; deductive logic).: </w:t>
-      </w:r>
-      <w:r>
-        <w:rPr>
-          <w:rFonts w:ascii="Calibri" w:cs="Calibri" w:eastAsia="Calibri" w:hAnsi="Calibri"/>
-          <w:color w:val="0F172A"/>
-          <w:sz w:val="20"/>
-          <w:szCs w:val="20"/>
-        </w:rPr>
-        <w:t xml:space="preserve">Dual-Batch Synthesis</w:t>
+        <w:t xml:space="preserve">parseMatrixGridFromQuestion extracts Row 1, Row 2, and Row 3 descriptions from question text, populating a 9-cell grid with interactive question marks and emerald solution highlights.: </w:t>
+      </w:r>
+      <w:r>
+        <w:rPr>
+          <w:rFonts w:ascii="Calibri" w:cs="Calibri" w:eastAsia="Calibri" w:hAnsi="Calibri"/>
+          <w:color w:val="0F172A"/>
+          <w:sz w:val="20"/>
+          <w:szCs w:val="20"/>
+        </w:rPr>
+        <w:t xml:space="preserve">3x3 Matrix Grid Parser</w:t>
       </w:r>
     </w:p>
     <w:p>
@@ -3921,16 +4025,16 @@
           <w:sz w:val="20"/>
           <w:szCs w:val="20"/>
         </w:rPr>
-        <w:t xml:space="preserve">Applies normalizeText to strip punctuation and case, checking against SEEN_QUESTIONS_KEY in browser storage to prevent repetition across sessions.: </w:t>
-      </w:r>
-      <w:r>
-        <w:rPr>
-          <w:rFonts w:ascii="Calibri" w:cs="Calibri" w:eastAsia="Calibri" w:hAnsi="Calibri"/>
-          <w:color w:val="0F172A"/>
-          <w:sz w:val="20"/>
-          <w:szCs w:val="20"/>
-        </w:rPr>
-        <w:t xml:space="preserve">String Normalization &amp; Signature Tracking</w:t>
+        <w:t xml:space="preserve">Computes isometric projections with depth-sorted back-to-front rendering and dynamic face shading (top: light, left: medium, right: dark).: </w:t>
+      </w:r>
+      <w:r>
+        <w:rPr>
+          <w:rFonts w:ascii="Calibri" w:cs="Calibri" w:eastAsia="Calibri" w:hAnsi="Calibri"/>
+          <w:color w:val="0F172A"/>
+          <w:sz w:val="20"/>
+          <w:szCs w:val="20"/>
+        </w:rPr>
+        <w:t xml:space="preserve">3D Isometric Cube Towers</w:t>
       </w:r>
     </w:p>
     <w:p>
@@ -3951,16 +4055,47 @@
           <w:sz w:val="20"/>
           <w:szCs w:val="20"/>
         </w:rPr>
-        <w:t xml:space="preserve">If deduplication yields 8 or 9 questions, immediately fetches a top-up batch to guarantee exactly 10 questions.: </w:t>
-      </w:r>
-      <w:r>
-        <w:rPr>
-          <w:rFonts w:ascii="Calibri" w:cs="Calibri" w:eastAsia="Calibri" w:hAnsi="Calibri"/>
-          <w:color w:val="0F172A"/>
-          <w:sz w:val="20"/>
-          <w:szCs w:val="20"/>
-        </w:rPr>
-        <w:t xml:space="preserve">Automated Top-Up Pass</w:t>
+        <w:t xml:space="preserve">Renders a glass prism bending incident white light into a 7-color rainbow spectrum with step-by-step ray physics.: </w:t>
+      </w:r>
+      <w:r>
+        <w:rPr>
+          <w:rFonts w:ascii="Calibri" w:cs="Calibri" w:eastAsia="Calibri" w:hAnsi="Calibri"/>
+          <w:color w:val="0F172A"/>
+          <w:sz w:val="20"/>
+          <w:szCs w:val="20"/>
+        </w:rPr>
+        <w:t xml:space="preserve">Optics Dispersion Prism</w:t>
+      </w:r>
+    </w:p>
+    <w:p>
+      <w:pPr>
+        <w:pStyle w:val="Heading2"/>
+        <w:spacing w:after="120" w:before="280"/>
+      </w:pPr>
+      <w:r>
+        <w:rPr>
+          <w:rFonts w:ascii="Calibri" w:cs="Calibri" w:eastAsia="Calibri" w:hAnsi="Calibri"/>
+          <w:b/>
+          <w:bCs/>
+          <w:color w:val="312E81"/>
+          <w:sz w:val="26"/>
+          <w:szCs w:val="26"/>
+        </w:rPr>
+        <w:t xml:space="preserve">4.5 Question Generation &amp; Deduplication Engine (src/services/aiGenerator.js)</w:t>
+      </w:r>
+    </w:p>
+    <w:p>
+      <w:pPr>
+        <w:spacing w:after="100" w:before="60" w:line="276"/>
+      </w:pPr>
+      <w:r>
+        <w:rPr>
+          <w:rFonts w:ascii="Calibri" w:cs="Calibri" w:eastAsia="Calibri" w:hAnsi="Calibri"/>
+          <w:color w:val="0F172A"/>
+          <w:sz w:val="21"/>
+          <w:szCs w:val="21"/>
+        </w:rPr>
+        <w:t xml:space="preserve">The question generation pipeline guarantees 10 unique, strictly age-calibrated questions per session.</w:t>
       </w:r>
     </w:p>
     <w:p>
@@ -3981,6 +4116,96 @@
           <w:sz w:val="20"/>
           <w:szCs w:val="20"/>
         </w:rPr>
+        <w:t xml:space="preserve">Fires two simultaneous requests for 6 questions each (12 total buffer) divided into pedagogical sub-domains (e.g. Batch 1: analogies &amp; riddles; Batch 2: sequences &amp; deductive logic).: </w:t>
+      </w:r>
+      <w:r>
+        <w:rPr>
+          <w:rFonts w:ascii="Calibri" w:cs="Calibri" w:eastAsia="Calibri" w:hAnsi="Calibri"/>
+          <w:color w:val="0F172A"/>
+          <w:sz w:val="20"/>
+          <w:szCs w:val="20"/>
+        </w:rPr>
+        <w:t xml:space="preserve">Dual-Batch Synthesis</w:t>
+      </w:r>
+    </w:p>
+    <w:p>
+      <w:pPr>
+        <w:pStyle w:val="ListParagraph"/>
+        <w:numPr>
+          <w:ilvl w:val="0"/>
+          <w:numId w:val="1"/>
+        </w:numPr>
+        <w:spacing w:after="60" w:before="40" w:line="260"/>
+      </w:pPr>
+      <w:r>
+        <w:rPr>
+          <w:rFonts w:ascii="Calibri" w:cs="Calibri" w:eastAsia="Calibri" w:hAnsi="Calibri"/>
+          <w:b/>
+          <w:bCs/>
+          <w:color w:val="0F172A"/>
+          <w:sz w:val="20"/>
+          <w:szCs w:val="20"/>
+        </w:rPr>
+        <w:t xml:space="preserve">Applies normalizeText to strip punctuation and case, checking against SEEN_QUESTIONS_KEY in browser storage to prevent repetition across sessions.: </w:t>
+      </w:r>
+      <w:r>
+        <w:rPr>
+          <w:rFonts w:ascii="Calibri" w:cs="Calibri" w:eastAsia="Calibri" w:hAnsi="Calibri"/>
+          <w:color w:val="0F172A"/>
+          <w:sz w:val="20"/>
+          <w:szCs w:val="20"/>
+        </w:rPr>
+        <w:t xml:space="preserve">String Normalization &amp; Signature Tracking</w:t>
+      </w:r>
+    </w:p>
+    <w:p>
+      <w:pPr>
+        <w:pStyle w:val="ListParagraph"/>
+        <w:numPr>
+          <w:ilvl w:val="0"/>
+          <w:numId w:val="1"/>
+        </w:numPr>
+        <w:spacing w:after="60" w:before="40" w:line="260"/>
+      </w:pPr>
+      <w:r>
+        <w:rPr>
+          <w:rFonts w:ascii="Calibri" w:cs="Calibri" w:eastAsia="Calibri" w:hAnsi="Calibri"/>
+          <w:b/>
+          <w:bCs/>
+          <w:color w:val="0F172A"/>
+          <w:sz w:val="20"/>
+          <w:szCs w:val="20"/>
+        </w:rPr>
+        <w:t xml:space="preserve">If deduplication yields 8 or 9 questions, immediately fetches a top-up batch to guarantee exactly 10 questions.: </w:t>
+      </w:r>
+      <w:r>
+        <w:rPr>
+          <w:rFonts w:ascii="Calibri" w:cs="Calibri" w:eastAsia="Calibri" w:hAnsi="Calibri"/>
+          <w:color w:val="0F172A"/>
+          <w:sz w:val="20"/>
+          <w:szCs w:val="20"/>
+        </w:rPr>
+        <w:t xml:space="preserve">Automated Top-Up Pass</w:t>
+      </w:r>
+    </w:p>
+    <w:p>
+      <w:pPr>
+        <w:pStyle w:val="ListParagraph"/>
+        <w:numPr>
+          <w:ilvl w:val="0"/>
+          <w:numId w:val="1"/>
+        </w:numPr>
+        <w:spacing w:after="60" w:before="40" w:line="260"/>
+      </w:pPr>
+      <w:r>
+        <w:rPr>
+          <w:rFonts w:ascii="Calibri" w:cs="Calibri" w:eastAsia="Calibri" w:hAnsi="Calibri"/>
+          <w:b/>
+          <w:bCs/>
+          <w:color w:val="0F172A"/>
+          <w:sz w:val="20"/>
+          <w:szCs w:val="20"/>
+        </w:rPr>
         <w:t xml:space="preserve">Attempts generation on the user-selected model first; if rate-limited or unavailable, cascades through gemini-3.5-flash-lite -&gt; gemini-3.5-flash -&gt; gemini-3-flash-preview -&gt; gemini-2.5-flash.: </w:t>
       </w:r>
       <w:r>
@@ -3991,6 +4216,279 @@
           <w:szCs w:val="20"/>
         </w:rPr>
         <w:t xml:space="preserve">Multi-Model Fallback Chain</w:t>
+      </w:r>
+    </w:p>
+    <w:p>
+      <w:pPr>
+        <w:pStyle w:val="Heading2"/>
+        <w:spacing w:after="120" w:before="280"/>
+      </w:pPr>
+      <w:r>
+        <w:rPr>
+          <w:rFonts w:ascii="Calibri" w:cs="Calibri" w:eastAsia="Calibri" w:hAnsi="Calibri"/>
+          <w:b/>
+          <w:bCs/>
+          <w:color w:val="312E81"/>
+          <w:sz w:val="26"/>
+          <w:szCs w:val="26"/>
+        </w:rPr>
+        <w:t xml:space="preserve">4.6 Space-Themed Cosmic Quest Loader (src/utils/CosmicQuestLoader.jsx)</w:t>
+      </w:r>
+    </w:p>
+    <w:p>
+      <w:pPr>
+        <w:spacing w:after="100" w:before="60" w:line="276"/>
+      </w:pPr>
+      <w:r>
+        <w:rPr>
+          <w:rFonts w:ascii="Calibri" w:cs="Calibri" w:eastAsia="Calibri" w:hAnsi="Calibri"/>
+          <w:color w:val="0F172A"/>
+          <w:sz w:val="21"/>
+          <w:szCs w:val="21"/>
+        </w:rPr>
+        <w:t xml:space="preserve">Replaces generic loading spinners with an interactive cosmic space mission theater providing rich real-time visual feedback while AI generates questions.</w:t>
+      </w:r>
+    </w:p>
+    <w:p>
+      <w:pPr>
+        <w:pStyle w:val="ListParagraph"/>
+        <w:numPr>
+          <w:ilvl w:val="0"/>
+          <w:numId w:val="1"/>
+        </w:numPr>
+        <w:spacing w:after="60" w:before="40" w:line="260"/>
+      </w:pPr>
+      <w:r>
+        <w:rPr>
+          <w:rFonts w:ascii="Calibri" w:cs="Calibri" w:eastAsia="Calibri" w:hAnsi="Calibri"/>
+          <w:b/>
+          <w:bCs/>
+          <w:color w:val="0F172A"/>
+          <w:sz w:val="20"/>
+          <w:szCs w:val="20"/>
+        </w:rPr>
+        <w:t xml:space="preserve">Features an orbiting vector rocket with dynamic plasma thruster flame (thrusterFlame), planetary rings, dual radar pulses, and a sci-fi energy warp progress bar.: </w:t>
+      </w:r>
+      <w:r>
+        <w:rPr>
+          <w:rFonts w:ascii="Calibri" w:cs="Calibri" w:eastAsia="Calibri" w:hAnsi="Calibri"/>
+          <w:color w:val="0F172A"/>
+          <w:sz w:val="20"/>
+          <w:szCs w:val="20"/>
+        </w:rPr>
+        <w:t xml:space="preserve">Immersive Space Mission Theater</w:t>
+      </w:r>
+    </w:p>
+    <w:p>
+      <w:pPr>
+        <w:pStyle w:val="ListParagraph"/>
+        <w:numPr>
+          <w:ilvl w:val="0"/>
+          <w:numId w:val="1"/>
+        </w:numPr>
+        <w:spacing w:after="60" w:before="40" w:line="260"/>
+      </w:pPr>
+      <w:r>
+        <w:rPr>
+          <w:rFonts w:ascii="Calibri" w:cs="Calibri" w:eastAsia="Calibri" w:hAnsi="Calibri"/>
+          <w:b/>
+          <w:bCs/>
+          <w:color w:val="0F172A"/>
+          <w:sz w:val="20"/>
+          <w:szCs w:val="20"/>
+        </w:rPr>
+        <w:t xml:space="preserve">Automatically binds the child's name and age from settings storage (getStoredKidName(), getStoredKidAge()), customizing telemetry steps and mission status cues.: </w:t>
+      </w:r>
+      <w:r>
+        <w:rPr>
+          <w:rFonts w:ascii="Calibri" w:cs="Calibri" w:eastAsia="Calibri" w:hAnsi="Calibri"/>
+          <w:color w:val="0F172A"/>
+          <w:sz w:val="20"/>
+          <w:szCs w:val="20"/>
+        </w:rPr>
+        <w:t xml:space="preserve">Dynamic Explorer Profile Binding</w:t>
+      </w:r>
+    </w:p>
+    <w:p>
+      <w:pPr>
+        <w:pStyle w:val="ListParagraph"/>
+        <w:numPr>
+          <w:ilvl w:val="0"/>
+          <w:numId w:val="1"/>
+        </w:numPr>
+        <w:spacing w:after="60" w:before="40" w:line="260"/>
+      </w:pPr>
+      <w:r>
+        <w:rPr>
+          <w:rFonts w:ascii="Calibri" w:cs="Calibri" w:eastAsia="Calibri" w:hAnsi="Calibri"/>
+          <w:b/>
+          <w:bCs/>
+          <w:color w:val="0F172A"/>
+          <w:sz w:val="20"/>
+          <w:szCs w:val="20"/>
+        </w:rPr>
+        <w:t xml:space="preserve">Dynamically queries the active skill from props or storage (getStoredSelectedSkill()), automatically adapting the loader's aesthetic: Visual (Cyan palette, glowing Eye core, eye particles) vs. Analytical Thinking (Purple palette, glowing Brain core, puzzle particles).: </w:t>
+      </w:r>
+      <w:r>
+        <w:rPr>
+          <w:rFonts w:ascii="Calibri" w:cs="Calibri" w:eastAsia="Calibri" w:hAnsi="Calibri"/>
+          <w:color w:val="0F172A"/>
+          <w:sz w:val="20"/>
+          <w:szCs w:val="20"/>
+        </w:rPr>
+        <w:t xml:space="preserve">Adaptive Skillset Extraction &amp; Theming</w:t>
+      </w:r>
+    </w:p>
+    <w:p>
+      <w:pPr>
+        <w:pStyle w:val="Heading2"/>
+        <w:spacing w:after="120" w:before="280"/>
+      </w:pPr>
+      <w:r>
+        <w:rPr>
+          <w:rFonts w:ascii="Calibri" w:cs="Calibri" w:eastAsia="Calibri" w:hAnsi="Calibri"/>
+          <w:b/>
+          <w:bCs/>
+          <w:color w:val="312E81"/>
+          <w:sz w:val="26"/>
+          <w:szCs w:val="26"/>
+        </w:rPr>
+        <w:t xml:space="preserve">4.7 Settings Dirty-State Guard &amp; Confirmation Engine (src/features/settings/SettingsScreen.jsx)</w:t>
+      </w:r>
+    </w:p>
+    <w:p>
+      <w:pPr>
+        <w:spacing w:after="100" w:before="60" w:line="276"/>
+      </w:pPr>
+      <w:r>
+        <w:rPr>
+          <w:rFonts w:ascii="Calibri" w:cs="Calibri" w:eastAsia="Calibri" w:hAnsi="Calibri"/>
+          <w:color w:val="0F172A"/>
+          <w:sz w:val="21"/>
+          <w:szCs w:val="21"/>
+        </w:rPr>
+        <w:t xml:space="preserve">Safeguards configuration modifications from accidental navigation loss.</w:t>
+      </w:r>
+    </w:p>
+    <w:p>
+      <w:pPr>
+        <w:pStyle w:val="ListParagraph"/>
+        <w:numPr>
+          <w:ilvl w:val="0"/>
+          <w:numId w:val="1"/>
+        </w:numPr>
+        <w:spacing w:after="60" w:before="40" w:line="260"/>
+      </w:pPr>
+      <w:r>
+        <w:rPr>
+          <w:rFonts w:ascii="Calibri" w:cs="Calibri" w:eastAsia="Calibri" w:hAnsi="Calibri"/>
+          <w:b/>
+          <w:bCs/>
+          <w:color w:val="0F172A"/>
+          <w:sz w:val="20"/>
+          <w:szCs w:val="20"/>
+        </w:rPr>
+        <w:t xml:space="preserve">Tracks granular dirty-state across all configuration parameters (name, age, API key, model, timer, auto-advance, voice, visual diagrams).: </w:t>
+      </w:r>
+      <w:r>
+        <w:rPr>
+          <w:rFonts w:ascii="Calibri" w:cs="Calibri" w:eastAsia="Calibri" w:hAnsi="Calibri"/>
+          <w:color w:val="0F172A"/>
+          <w:sz w:val="20"/>
+          <w:szCs w:val="20"/>
+        </w:rPr>
+        <w:t xml:space="preserve">Unsaved Changes Interception</w:t>
+      </w:r>
+    </w:p>
+    <w:p>
+      <w:pPr>
+        <w:pStyle w:val="ListParagraph"/>
+        <w:numPr>
+          <w:ilvl w:val="0"/>
+          <w:numId w:val="1"/>
+        </w:numPr>
+        <w:spacing w:after="60" w:before="40" w:line="260"/>
+      </w:pPr>
+      <w:r>
+        <w:rPr>
+          <w:rFonts w:ascii="Calibri" w:cs="Calibri" w:eastAsia="Calibri" w:hAnsi="Calibri"/>
+          <w:b/>
+          <w:bCs/>
+          <w:color w:val="0F172A"/>
+          <w:sz w:val="20"/>
+          <w:szCs w:val="20"/>
+        </w:rPr>
+        <w:t xml:space="preserve">If the user attempts to navigate back to the dashboard with unsaved modifications, an interactive modal warns the user with options to "Save &amp; Continue" or "Discard Changes" (safely reverting to saved state).: </w:t>
+      </w:r>
+      <w:r>
+        <w:rPr>
+          <w:rFonts w:ascii="Calibri" w:cs="Calibri" w:eastAsia="Calibri" w:hAnsi="Calibri"/>
+          <w:color w:val="0F172A"/>
+          <w:sz w:val="20"/>
+          <w:szCs w:val="20"/>
+        </w:rPr>
+        <w:t xml:space="preserve">Navigation Guard Dialog</w:t>
+      </w:r>
+    </w:p>
+    <w:p>
+      <w:pPr>
+        <w:pStyle w:val="Heading2"/>
+        <w:spacing w:after="120" w:before="280"/>
+      </w:pPr>
+      <w:r>
+        <w:rPr>
+          <w:rFonts w:ascii="Calibri" w:cs="Calibri" w:eastAsia="Calibri" w:hAnsi="Calibri"/>
+          <w:b/>
+          <w:bCs/>
+          <w:color w:val="312E81"/>
+          <w:sz w:val="26"/>
+          <w:szCs w:val="26"/>
+        </w:rPr>
+        <w:t xml:space="preserve">4.8 Question Review Accordion &amp; Batch Controls (src/features/results/QuestionSummary.jsx)</w:t>
+      </w:r>
+    </w:p>
+    <w:p>
+      <w:pPr>
+        <w:spacing w:after="100" w:before="60" w:line="276"/>
+      </w:pPr>
+      <w:r>
+        <w:rPr>
+          <w:rFonts w:ascii="Calibri" w:cs="Calibri" w:eastAsia="Calibri" w:hAnsi="Calibri"/>
+          <w:color w:val="0F172A"/>
+          <w:sz w:val="21"/>
+          <w:szCs w:val="21"/>
+        </w:rPr>
+        <w:t xml:space="preserve">Streamlines evaluation of the completed quest with one-click batch controls.</w:t>
+      </w:r>
+    </w:p>
+    <w:p>
+      <w:pPr>
+        <w:pStyle w:val="ListParagraph"/>
+        <w:numPr>
+          <w:ilvl w:val="0"/>
+          <w:numId w:val="1"/>
+        </w:numPr>
+        <w:spacing w:after="60" w:before="40" w:line="260"/>
+      </w:pPr>
+      <w:r>
+        <w:rPr>
+          <w:rFonts w:ascii="Calibri" w:cs="Calibri" w:eastAsia="Calibri" w:hAnsi="Calibri"/>
+          <w:b/>
+          <w:bCs/>
+          <w:color w:val="0F172A"/>
+          <w:sz w:val="20"/>
+          <w:szCs w:val="20"/>
+        </w:rPr>
+        <w:t xml:space="preserve">Equips the question review accordion with Expand All (ChevronsDownUp) and Collapse All (ChevronsUpDown) action buttons, enabling teachers and parents to review all 10 solutions simultaneously with a single click.: </w:t>
+      </w:r>
+      <w:r>
+        <w:rPr>
+          <w:rFonts w:ascii="Calibri" w:cs="Calibri" w:eastAsia="Calibri" w:hAnsi="Calibri"/>
+          <w:color w:val="0F172A"/>
+          <w:sz w:val="20"/>
+          <w:szCs w:val="20"/>
+        </w:rPr>
+        <w:t xml:space="preserve">Batch Expansion Controls</w:t>
       </w:r>
     </w:p>
     <w:p>
@@ -5505,7 +6003,7 @@
                 <w:sz w:val="19"/>
                 <w:szCs w:val="19"/>
               </w:rPr>
-              <w:t xml:space="preserve">Visual Diagrams toggle: Disabled by Default (Hidden / Shown).</w:t>
+              <w:t xml:space="preserve">Visual Diagrams toggle: Shown or Hidden.</w:t>
             </w:r>
           </w:p>
         </w:tc>
@@ -6248,6 +6746,366 @@
                 <w:szCs w:val="19"/>
               </w:rPr>
               <w:t xml:space="preserve">features/quest/ExitConfirmationModal.jsx</w:t>
+            </w:r>
+          </w:p>
+        </w:tc>
+      </w:tr>
+      <w:tr>
+        <w:tc>
+          <w:tcPr>
+            <w:shd w:fill="FFFFFF" w:val="clear"/>
+            <w:tcMar>
+              <w:top w:type="dxa" w:w="100"/>
+              <w:left w:type="dxa" w:w="140"/>
+              <w:bottom w:type="dxa" w:w="100"/>
+              <w:right w:type="dxa" w:w="140"/>
+            </w:tcMar>
+          </w:tcPr>
+          <w:p>
+            <w:r>
+              <w:rPr>
+                <w:rFonts w:ascii="Calibri" w:cs="Calibri" w:eastAsia="Calibri" w:hAnsi="Calibri"/>
+                <w:color w:val="0F172A"/>
+                <w:sz w:val="19"/>
+                <w:szCs w:val="19"/>
+              </w:rPr>
+              <w:t xml:space="preserve">Cosmic Quest Loader</w:t>
+            </w:r>
+          </w:p>
+        </w:tc>
+        <w:tc>
+          <w:tcPr>
+            <w:shd w:fill="FFFFFF" w:val="clear"/>
+            <w:tcMar>
+              <w:top w:type="dxa" w:w="100"/>
+              <w:left w:type="dxa" w:w="140"/>
+              <w:bottom w:type="dxa" w:w="100"/>
+              <w:right w:type="dxa" w:w="140"/>
+            </w:tcMar>
+          </w:tcPr>
+          <w:p>
+            <w:r>
+              <w:rPr>
+                <w:rFonts w:ascii="Calibri" w:cs="Calibri" w:eastAsia="Calibri" w:hAnsi="Calibri"/>
+                <w:color w:val="0F172A"/>
+                <w:sz w:val="19"/>
+                <w:szCs w:val="19"/>
+              </w:rPr>
+              <w:t xml:space="preserve">Interactive space mission theater with orbiting vector rocket, plasma flame, and real-time telemetry.</w:t>
+            </w:r>
+          </w:p>
+        </w:tc>
+        <w:tc>
+          <w:tcPr>
+            <w:shd w:fill="FFFFFF" w:val="clear"/>
+            <w:tcMar>
+              <w:top w:type="dxa" w:w="100"/>
+              <w:left w:type="dxa" w:w="140"/>
+              <w:bottom w:type="dxa" w:w="100"/>
+              <w:right w:type="dxa" w:w="140"/>
+            </w:tcMar>
+          </w:tcPr>
+          <w:p>
+            <w:r>
+              <w:rPr>
+                <w:rFonts w:ascii="Calibri" w:cs="Calibri" w:eastAsia="Calibri" w:hAnsi="Calibri"/>
+                <w:color w:val="0F172A"/>
+                <w:sz w:val="19"/>
+                <w:szCs w:val="19"/>
+              </w:rPr>
+              <w:t xml:space="preserve">Adaptive theming: Visual (Eye) vs Analytical (Brain); dynamic name/age.</w:t>
+            </w:r>
+          </w:p>
+        </w:tc>
+        <w:tc>
+          <w:tcPr>
+            <w:shd w:fill="FFFFFF" w:val="clear"/>
+            <w:tcMar>
+              <w:top w:type="dxa" w:w="100"/>
+              <w:left w:type="dxa" w:w="140"/>
+              <w:bottom w:type="dxa" w:w="100"/>
+              <w:right w:type="dxa" w:w="140"/>
+            </w:tcMar>
+          </w:tcPr>
+          <w:p>
+            <w:r>
+              <w:rPr>
+                <w:rFonts w:ascii="Calibri" w:cs="Calibri" w:eastAsia="Calibri" w:hAnsi="Calibri"/>
+                <w:color w:val="0F172A"/>
+                <w:sz w:val="19"/>
+                <w:szCs w:val="19"/>
+              </w:rPr>
+              <w:t xml:space="preserve">utils/CosmicQuestLoader.jsx</w:t>
+            </w:r>
+          </w:p>
+        </w:tc>
+      </w:tr>
+      <w:tr>
+        <w:tc>
+          <w:tcPr>
+            <w:shd w:fill="F8FAFC" w:val="clear"/>
+            <w:tcMar>
+              <w:top w:type="dxa" w:w="100"/>
+              <w:left w:type="dxa" w:w="140"/>
+              <w:bottom w:type="dxa" w:w="100"/>
+              <w:right w:type="dxa" w:w="140"/>
+            </w:tcMar>
+          </w:tcPr>
+          <w:p>
+            <w:r>
+              <w:rPr>
+                <w:rFonts w:ascii="Calibri" w:cs="Calibri" w:eastAsia="Calibri" w:hAnsi="Calibri"/>
+                <w:color w:val="0F172A"/>
+                <w:sz w:val="19"/>
+                <w:szCs w:val="19"/>
+              </w:rPr>
+              <w:t xml:space="preserve">Settings Dirty-State Guard</w:t>
+            </w:r>
+          </w:p>
+        </w:tc>
+        <w:tc>
+          <w:tcPr>
+            <w:shd w:fill="F8FAFC" w:val="clear"/>
+            <w:tcMar>
+              <w:top w:type="dxa" w:w="100"/>
+              <w:left w:type="dxa" w:w="140"/>
+              <w:bottom w:type="dxa" w:w="100"/>
+              <w:right w:type="dxa" w:w="140"/>
+            </w:tcMar>
+          </w:tcPr>
+          <w:p>
+            <w:r>
+              <w:rPr>
+                <w:rFonts w:ascii="Calibri" w:cs="Calibri" w:eastAsia="Calibri" w:hAnsi="Calibri"/>
+                <w:color w:val="0F172A"/>
+                <w:sz w:val="19"/>
+                <w:szCs w:val="19"/>
+              </w:rPr>
+              <w:t xml:space="preserve">Intercepts navigation with unsaved changes; offers to save or safely discard edits.</w:t>
+            </w:r>
+          </w:p>
+        </w:tc>
+        <w:tc>
+          <w:tcPr>
+            <w:shd w:fill="F8FAFC" w:val="clear"/>
+            <w:tcMar>
+              <w:top w:type="dxa" w:w="100"/>
+              <w:left w:type="dxa" w:w="140"/>
+              <w:bottom w:type="dxa" w:w="100"/>
+              <w:right w:type="dxa" w:w="140"/>
+            </w:tcMar>
+          </w:tcPr>
+          <w:p>
+            <w:r>
+              <w:rPr>
+                <w:rFonts w:ascii="Calibri" w:cs="Calibri" w:eastAsia="Calibri" w:hAnsi="Calibri"/>
+                <w:color w:val="0F172A"/>
+                <w:sz w:val="19"/>
+                <w:szCs w:val="19"/>
+              </w:rPr>
+              <w:t xml:space="preserve">Confirmation modal on navigating back with uncommitted changes.</w:t>
+            </w:r>
+          </w:p>
+        </w:tc>
+        <w:tc>
+          <w:tcPr>
+            <w:shd w:fill="F8FAFC" w:val="clear"/>
+            <w:tcMar>
+              <w:top w:type="dxa" w:w="100"/>
+              <w:left w:type="dxa" w:w="140"/>
+              <w:bottom w:type="dxa" w:w="100"/>
+              <w:right w:type="dxa" w:w="140"/>
+            </w:tcMar>
+          </w:tcPr>
+          <w:p>
+            <w:r>
+              <w:rPr>
+                <w:rFonts w:ascii="Calibri" w:cs="Calibri" w:eastAsia="Calibri" w:hAnsi="Calibri"/>
+                <w:color w:val="0F172A"/>
+                <w:sz w:val="19"/>
+                <w:szCs w:val="19"/>
+              </w:rPr>
+              <w:t xml:space="preserve">features/settings/SettingsScreen.jsx</w:t>
+            </w:r>
+          </w:p>
+        </w:tc>
+      </w:tr>
+      <w:tr>
+        <w:tc>
+          <w:tcPr>
+            <w:shd w:fill="FFFFFF" w:val="clear"/>
+            <w:tcMar>
+              <w:top w:type="dxa" w:w="100"/>
+              <w:left w:type="dxa" w:w="140"/>
+              <w:bottom w:type="dxa" w:w="100"/>
+              <w:right w:type="dxa" w:w="140"/>
+            </w:tcMar>
+          </w:tcPr>
+          <w:p>
+            <w:r>
+              <w:rPr>
+                <w:rFonts w:ascii="Calibri" w:cs="Calibri" w:eastAsia="Calibri" w:hAnsi="Calibri"/>
+                <w:color w:val="0F172A"/>
+                <w:sz w:val="19"/>
+                <w:szCs w:val="19"/>
+              </w:rPr>
+              <w:t xml:space="preserve">Question Review Accordion</w:t>
+            </w:r>
+          </w:p>
+        </w:tc>
+        <w:tc>
+          <w:tcPr>
+            <w:shd w:fill="FFFFFF" w:val="clear"/>
+            <w:tcMar>
+              <w:top w:type="dxa" w:w="100"/>
+              <w:left w:type="dxa" w:w="140"/>
+              <w:bottom w:type="dxa" w:w="100"/>
+              <w:right w:type="dxa" w:w="140"/>
+            </w:tcMar>
+          </w:tcPr>
+          <w:p>
+            <w:r>
+              <w:rPr>
+                <w:rFonts w:ascii="Calibri" w:cs="Calibri" w:eastAsia="Calibri" w:hAnsi="Calibri"/>
+                <w:color w:val="0F172A"/>
+                <w:sz w:val="19"/>
+                <w:szCs w:val="19"/>
+              </w:rPr>
+              <w:t xml:space="preserve">Expand or collapse all 10 question reviews simultaneously for rapid parent/educator evaluation.</w:t>
+            </w:r>
+          </w:p>
+        </w:tc>
+        <w:tc>
+          <w:tcPr>
+            <w:shd w:fill="FFFFFF" w:val="clear"/>
+            <w:tcMar>
+              <w:top w:type="dxa" w:w="100"/>
+              <w:left w:type="dxa" w:w="140"/>
+              <w:bottom w:type="dxa" w:w="100"/>
+              <w:right w:type="dxa" w:w="140"/>
+            </w:tcMar>
+          </w:tcPr>
+          <w:p>
+            <w:r>
+              <w:rPr>
+                <w:rFonts w:ascii="Calibri" w:cs="Calibri" w:eastAsia="Calibri" w:hAnsi="Calibri"/>
+                <w:color w:val="0F172A"/>
+                <w:sz w:val="19"/>
+                <w:szCs w:val="19"/>
+              </w:rPr>
+              <w:t xml:space="preserve">"Expand All" and "Collapse All" toggle buttons.</w:t>
+            </w:r>
+          </w:p>
+        </w:tc>
+        <w:tc>
+          <w:tcPr>
+            <w:shd w:fill="FFFFFF" w:val="clear"/>
+            <w:tcMar>
+              <w:top w:type="dxa" w:w="100"/>
+              <w:left w:type="dxa" w:w="140"/>
+              <w:bottom w:type="dxa" w:w="100"/>
+              <w:right w:type="dxa" w:w="140"/>
+            </w:tcMar>
+          </w:tcPr>
+          <w:p>
+            <w:r>
+              <w:rPr>
+                <w:rFonts w:ascii="Calibri" w:cs="Calibri" w:eastAsia="Calibri" w:hAnsi="Calibri"/>
+                <w:color w:val="0F172A"/>
+                <w:sz w:val="19"/>
+                <w:szCs w:val="19"/>
+              </w:rPr>
+              <w:t xml:space="preserve">features/results/QuestionSummary.jsx</w:t>
+            </w:r>
+          </w:p>
+        </w:tc>
+      </w:tr>
+      <w:tr>
+        <w:tc>
+          <w:tcPr>
+            <w:shd w:fill="F8FAFC" w:val="clear"/>
+            <w:tcMar>
+              <w:top w:type="dxa" w:w="100"/>
+              <w:left w:type="dxa" w:w="140"/>
+              <w:bottom w:type="dxa" w:w="100"/>
+              <w:right w:type="dxa" w:w="140"/>
+            </w:tcMar>
+          </w:tcPr>
+          <w:p>
+            <w:r>
+              <w:rPr>
+                <w:rFonts w:ascii="Calibri" w:cs="Calibri" w:eastAsia="Calibri" w:hAnsi="Calibri"/>
+                <w:color w:val="0F172A"/>
+                <w:sz w:val="19"/>
+                <w:szCs w:val="19"/>
+              </w:rPr>
+              <w:t xml:space="preserve">Vector Moon &amp; Celestial Shapes</w:t>
+            </w:r>
+          </w:p>
+        </w:tc>
+        <w:tc>
+          <w:tcPr>
+            <w:shd w:fill="F8FAFC" w:val="clear"/>
+            <w:tcMar>
+              <w:top w:type="dxa" w:w="100"/>
+              <w:left w:type="dxa" w:w="140"/>
+              <w:bottom w:type="dxa" w:w="100"/>
+              <w:right w:type="dxa" w:w="140"/>
+            </w:tcMar>
+          </w:tcPr>
+          <w:p>
+            <w:r>
+              <w:rPr>
+                <w:rFonts w:ascii="Calibri" w:cs="Calibri" w:eastAsia="Calibri" w:hAnsi="Calibri"/>
+                <w:color w:val="0F172A"/>
+                <w:sz w:val="19"/>
+                <w:szCs w:val="19"/>
+              </w:rPr>
+              <w:t xml:space="preserve">Mathematical SVG crescent curve, emoji recognition, and deduplicated card label display.</w:t>
+            </w:r>
+          </w:p>
+        </w:tc>
+        <w:tc>
+          <w:tcPr>
+            <w:shd w:fill="F8FAFC" w:val="clear"/>
+            <w:tcMar>
+              <w:top w:type="dxa" w:w="100"/>
+              <w:left w:type="dxa" w:w="140"/>
+              <w:bottom w:type="dxa" w:w="100"/>
+              <w:right w:type="dxa" w:w="140"/>
+            </w:tcMar>
+          </w:tcPr>
+          <w:p>
+            <w:r>
+              <w:rPr>
+                <w:rFonts w:ascii="Calibri" w:cs="Calibri" w:eastAsia="Calibri" w:hAnsi="Calibri"/>
+                <w:color w:val="0F172A"/>
+                <w:sz w:val="19"/>
+                <w:szCs w:val="19"/>
+              </w:rPr>
+              <w:t xml:space="preserve">Automatic via dynamic shape parser and SVG renderer.</w:t>
+            </w:r>
+          </w:p>
+        </w:tc>
+        <w:tc>
+          <w:tcPr>
+            <w:shd w:fill="F8FAFC" w:val="clear"/>
+            <w:tcMar>
+              <w:top w:type="dxa" w:w="100"/>
+              <w:left w:type="dxa" w:w="140"/>
+              <w:bottom w:type="dxa" w:w="100"/>
+              <w:right w:type="dxa" w:w="140"/>
+            </w:tcMar>
+          </w:tcPr>
+          <w:p>
+            <w:r>
+              <w:rPr>
+                <w:rFonts w:ascii="Calibri" w:cs="Calibri" w:eastAsia="Calibri" w:hAnsi="Calibri"/>
+                <w:color w:val="0F172A"/>
+                <w:sz w:val="19"/>
+                <w:szCs w:val="19"/>
+              </w:rPr>
+              <w:t xml:space="preserve">utils/shapeGenerator.jsx</w:t>
             </w:r>
           </w:p>
         </w:tc>
@@ -6677,6 +7535,36 @@
           <w:szCs w:val="20"/>
         </w:rPr>
         <w:t xml:space="preserve">Single-Voice Guarantee Test</w:t>
+      </w:r>
+    </w:p>
+    <w:p>
+      <w:pPr>
+        <w:pStyle w:val="ListParagraph"/>
+        <w:numPr>
+          <w:ilvl w:val="0"/>
+          <w:numId w:val="1"/>
+        </w:numPr>
+        <w:spacing w:after="60" w:before="40" w:line="260"/>
+      </w:pPr>
+      <w:r>
+        <w:rPr>
+          <w:rFonts w:ascii="Calibri" w:cs="Calibri" w:eastAsia="Calibri" w:hAnsi="Calibri"/>
+          <w:b/>
+          <w:bCs/>
+          <w:color w:val="0F172A"/>
+          <w:sz w:val="20"/>
+          <w:szCs w:val="20"/>
+        </w:rPr>
+        <w:t xml:space="preserve">Configured Git filesystem synchronization (git config core.fsync index,committed) and added standalone PowerShell recovery script scripts/fix-git-index.ps1 and npm shortcut "npm run fix-git" to instantly recover from zero-byte Windows index truncation (fatal: .git/index: index file smaller than expected) without data loss.: </w:t>
+      </w:r>
+      <w:r>
+        <w:rPr>
+          <w:rFonts w:ascii="Calibri" w:cs="Calibri" w:eastAsia="Calibri" w:hAnsi="Calibri"/>
+          <w:color w:val="0F172A"/>
+          <w:sz w:val="20"/>
+          <w:szCs w:val="20"/>
+        </w:rPr>
+        <w:t xml:space="preserve">Automated Windows Git Index Integrity Tool (scripts/fix-git-index.ps1)</w:t>
       </w:r>
     </w:p>
     <w:sectPr>

</xml_diff>